<commit_message>
cambios en archivo de ejemplo
</commit_message>
<xml_diff>
--- a/example/2_carta_retiro.docx
+++ b/example/2_carta_retiro.docx
@@ -506,27 +506,158 @@
           <w:sz w:val="22"/>
           <w:szCs w:val="22"/>
         </w:rPr>
+        <w:t xml:space="preserve"> Por este medio solicitamos el </w:t>
+      </w:r>
+      <w:r>
+        <w:rPr>
+          <w:rFonts w:ascii="Helvetica" w:hAnsi="Helvetica" w:cs="Segoe UI"/>
+          <w:b/>
+          <w:bCs/>
+          <w:color w:val="000000" w:themeColor="text1"/>
+          <w:sz w:val="22"/>
+          <w:szCs w:val="22"/>
+        </w:rPr>
+        <w:t>RETIRO DEL ESTUDIANTE</w:t>
+      </w:r>
+      <w:r>
+        <w:rPr>
+          <w:rFonts w:ascii="Helvetica" w:hAnsi="Helvetica" w:cs="Segoe UI"/>
+          <w:color w:val="000000" w:themeColor="text1"/>
+          <w:sz w:val="22"/>
+          <w:szCs w:val="22"/>
+        </w:rPr>
         <w:t xml:space="preserve"> </w:t>
       </w:r>
       <w:r>
         <w:rPr>
           <w:rFonts w:ascii="Helvetica" w:hAnsi="Helvetica" w:cs="Segoe UI"/>
-          <w:color w:val="000000" w:themeColor="text1"/>
-          <w:sz w:val="22"/>
-          <w:szCs w:val="22"/>
-        </w:rPr>
-        <w:t xml:space="preserve">Por este medio solicitamos el </w:t>
-      </w:r>
-      <w:r>
-        <w:rPr>
-          <w:rFonts w:ascii="Helvetica" w:hAnsi="Helvetica" w:cs="Segoe UI"/>
-          <w:b/>
-          <w:bCs/>
-          <w:color w:val="000000" w:themeColor="text1"/>
-          <w:sz w:val="22"/>
-          <w:szCs w:val="22"/>
-        </w:rPr>
-        <w:t>RETIRO DEL ESTUDIANTE</w:t>
+          <w:b/>
+          <w:bCs/>
+          <w:color w:val="000000" w:themeColor="text1"/>
+          <w:sz w:val="22"/>
+          <w:szCs w:val="22"/>
+        </w:rPr>
+        <w:t xml:space="preserve">Marvin Mauricio Molina Maldonado </w:t>
+      </w:r>
+      <w:r>
+        <w:rPr>
+          <w:rFonts w:ascii="Helvetica" w:hAnsi="Helvetica" w:cs="Segoe UI"/>
+          <w:color w:val="000000" w:themeColor="text1"/>
+          <w:sz w:val="22"/>
+          <w:szCs w:val="22"/>
+        </w:rPr>
+        <w:t xml:space="preserve">con </w:t>
+      </w:r>
+      <w:proofErr w:type="gramStart"/>
+      <w:r>
+        <w:rPr>
+          <w:rFonts w:ascii="Helvetica" w:hAnsi="Helvetica" w:cs="Segoe UI"/>
+          <w:color w:val="000000" w:themeColor="text1"/>
+          <w:sz w:val="22"/>
+          <w:szCs w:val="22"/>
+        </w:rPr>
+        <w:t>Carnet</w:t>
+      </w:r>
+      <w:proofErr w:type="gramEnd"/>
+      <w:r>
+        <w:rPr>
+          <w:rFonts w:ascii="Helvetica" w:hAnsi="Helvetica" w:cs="Segoe UI"/>
+          <w:color w:val="000000" w:themeColor="text1"/>
+          <w:sz w:val="22"/>
+          <w:szCs w:val="22"/>
+        </w:rPr>
+        <w:t xml:space="preserve"> No. </w:t>
+      </w:r>
+      <w:r>
+        <w:rPr>
+          <w:rFonts w:ascii="Helvetica" w:hAnsi="Helvetica" w:cs="Segoe UI"/>
+          <w:b/>
+          <w:bCs/>
+          <w:color w:val="000000" w:themeColor="text1"/>
+          <w:sz w:val="22"/>
+          <w:szCs w:val="22"/>
+        </w:rPr>
+        <w:t>MM23077</w:t>
+      </w:r>
+      <w:r>
+        <w:rPr>
+          <w:rFonts w:ascii="Helvetica" w:hAnsi="Helvetica" w:cs="Segoe UI"/>
+          <w:color w:val="000000" w:themeColor="text1"/>
+          <w:sz w:val="22"/>
+          <w:szCs w:val="22"/>
+        </w:rPr>
+        <w:t xml:space="preserve">, del PROYECTO DE SERVICIO SOCIAL No. </w:t>
+      </w:r>
+      <w:r>
+        <w:rPr>
+          <w:rFonts w:ascii="Helvetica" w:hAnsi="Helvetica" w:cs="Segoe UI"/>
+          <w:b/>
+          <w:bCs/>
+          <w:color w:val="000000" w:themeColor="text1"/>
+          <w:sz w:val="22"/>
+          <w:szCs w:val="22"/>
+        </w:rPr>
+        <w:t>#330099</w:t>
+      </w:r>
+      <w:r>
+        <w:rPr>
+          <w:rFonts w:ascii="Helvetica" w:hAnsi="Helvetica" w:cs="Segoe UI"/>
+          <w:color w:val="000000" w:themeColor="text1"/>
+          <w:sz w:val="22"/>
+          <w:szCs w:val="22"/>
+        </w:rPr>
+        <w:t xml:space="preserve"> con fecha de inicio 07 de agosto de 2025 y finalización 03 de marzo de 2026. Inscrito en el sistema PROMETEO como </w:t>
+      </w:r>
+      <w:r>
+        <w:rPr>
+          <w:rFonts w:ascii="Helvetica" w:hAnsi="Helvetica" w:cs="Segoe UI"/>
+          <w:b/>
+          <w:bCs/>
+          <w:color w:val="000000" w:themeColor="text1"/>
+          <w:sz w:val="22"/>
+          <w:szCs w:val="22"/>
+        </w:rPr>
+        <w:t>“Apoyo en Actividades Administrativas y Jurídicas de la Oficina Fiscal de San Miguel”</w:t>
+      </w:r>
+      <w:r>
+        <w:rPr>
+          <w:rFonts w:ascii="Helvetica" w:hAnsi="Helvetica" w:cs="Segoe UI"/>
+          <w:color w:val="000000" w:themeColor="text1"/>
+          <w:sz w:val="22"/>
+          <w:szCs w:val="22"/>
+        </w:rPr>
+        <w:t xml:space="preserve"> a desarrollar en la </w:t>
+      </w:r>
+      <w:r>
+        <w:rPr>
+          <w:rFonts w:ascii="Helvetica" w:hAnsi="Helvetica" w:cs="Segoe UI"/>
+          <w:b/>
+          <w:bCs/>
+          <w:color w:val="000000" w:themeColor="text1"/>
+          <w:sz w:val="22"/>
+          <w:szCs w:val="22"/>
+        </w:rPr>
+        <w:t>fiscalía general de la República, 15 calle oriente #804, Barrio Concepción, San Miguel Centro, San Miguel</w:t>
+      </w:r>
+      <w:r>
+        <w:rPr>
+          <w:rFonts w:ascii="Helvetica" w:hAnsi="Helvetica" w:cs="Segoe UI"/>
+          <w:color w:val="000000" w:themeColor="text1"/>
+          <w:sz w:val="22"/>
+          <w:szCs w:val="22"/>
+        </w:rPr>
+        <w:t xml:space="preserve">, siendo el Tutor el </w:t>
+      </w:r>
+      <w:r>
+        <w:rPr>
+          <w:rFonts w:ascii="Helvetica" w:hAnsi="Helvetica" w:cs="Segoe UI"/>
+          <w:b/>
+          <w:bCs/>
+          <w:color w:val="000000" w:themeColor="text1"/>
+          <w:sz w:val="22"/>
+          <w:szCs w:val="22"/>
+        </w:rPr>
+        <w:t>Lic.</w:t>
       </w:r>
       <w:r>
         <w:rPr>
@@ -546,220 +677,7 @@
           <w:sz w:val="22"/>
           <w:szCs w:val="22"/>
         </w:rPr>
-        <w:t xml:space="preserve">Marvin </w:t>
-      </w:r>
-      <w:r>
-        <w:rPr>
-          <w:rFonts w:ascii="Helvetica" w:hAnsi="Helvetica" w:cs="Segoe UI"/>
-          <w:b/>
-          <w:bCs/>
-          <w:color w:val="000000" w:themeColor="text1"/>
-          <w:sz w:val="22"/>
-          <w:szCs w:val="22"/>
-        </w:rPr>
-        <w:t>Maurici</w:t>
-      </w:r>
-      <w:r>
-        <w:rPr>
-          <w:rFonts w:ascii="Helvetica" w:hAnsi="Helvetica" w:cs="Segoe UI"/>
-          <w:b/>
-          <w:bCs/>
-          <w:color w:val="000000" w:themeColor="text1"/>
-          <w:sz w:val="22"/>
-          <w:szCs w:val="22"/>
-        </w:rPr>
-        <w:t>o</w:t>
-      </w:r>
-      <w:r>
-        <w:rPr>
-          <w:rFonts w:ascii="Helvetica" w:hAnsi="Helvetica" w:cs="Segoe UI"/>
-          <w:b/>
-          <w:bCs/>
-          <w:color w:val="000000" w:themeColor="text1"/>
-          <w:sz w:val="22"/>
-          <w:szCs w:val="22"/>
-        </w:rPr>
-        <w:t xml:space="preserve"> </w:t>
-      </w:r>
-      <w:r>
-        <w:rPr>
-          <w:rFonts w:ascii="Helvetica" w:hAnsi="Helvetica" w:cs="Segoe UI"/>
-          <w:b/>
-          <w:bCs/>
-          <w:color w:val="000000" w:themeColor="text1"/>
-          <w:sz w:val="22"/>
-          <w:szCs w:val="22"/>
-        </w:rPr>
-        <w:t xml:space="preserve">Molina Maldonado </w:t>
-      </w:r>
-      <w:r>
-        <w:rPr>
-          <w:rFonts w:ascii="Helvetica" w:hAnsi="Helvetica" w:cs="Segoe UI"/>
-          <w:color w:val="000000" w:themeColor="text1"/>
-          <w:sz w:val="22"/>
-          <w:szCs w:val="22"/>
-        </w:rPr>
-        <w:t xml:space="preserve">con </w:t>
-      </w:r>
-      <w:proofErr w:type="gramStart"/>
-      <w:r>
-        <w:rPr>
-          <w:rFonts w:ascii="Helvetica" w:hAnsi="Helvetica" w:cs="Segoe UI"/>
-          <w:color w:val="000000" w:themeColor="text1"/>
-          <w:sz w:val="22"/>
-          <w:szCs w:val="22"/>
-        </w:rPr>
-        <w:t>Carnet</w:t>
-      </w:r>
-      <w:proofErr w:type="gramEnd"/>
-      <w:r>
-        <w:rPr>
-          <w:rFonts w:ascii="Helvetica" w:hAnsi="Helvetica" w:cs="Segoe UI"/>
-          <w:color w:val="000000" w:themeColor="text1"/>
-          <w:sz w:val="22"/>
-          <w:szCs w:val="22"/>
-        </w:rPr>
-        <w:t xml:space="preserve"> No. </w:t>
-      </w:r>
-      <w:r>
-        <w:rPr>
-          <w:rFonts w:ascii="Helvetica" w:hAnsi="Helvetica" w:cs="Segoe UI"/>
-          <w:b/>
-          <w:bCs/>
-          <w:color w:val="000000" w:themeColor="text1"/>
-          <w:sz w:val="22"/>
-          <w:szCs w:val="22"/>
-        </w:rPr>
-        <w:t>MM23077</w:t>
-      </w:r>
-      <w:r>
-        <w:rPr>
-          <w:rFonts w:ascii="Helvetica" w:hAnsi="Helvetica" w:cs="Segoe UI"/>
-          <w:color w:val="000000" w:themeColor="text1"/>
-          <w:sz w:val="22"/>
-          <w:szCs w:val="22"/>
-        </w:rPr>
-        <w:t xml:space="preserve">, del PROYECTO DE SERVICIO SOCIAL No. </w:t>
-      </w:r>
-      <w:r>
-        <w:rPr>
-          <w:rFonts w:ascii="Helvetica" w:hAnsi="Helvetica" w:cs="Segoe UI"/>
-          <w:b/>
-          <w:bCs/>
-          <w:color w:val="000000" w:themeColor="text1"/>
-          <w:sz w:val="22"/>
-          <w:szCs w:val="22"/>
-        </w:rPr>
-        <w:t>#330099</w:t>
-      </w:r>
-      <w:r>
-        <w:rPr>
-          <w:rFonts w:ascii="Helvetica" w:hAnsi="Helvetica" w:cs="Segoe UI"/>
-          <w:color w:val="000000" w:themeColor="text1"/>
-          <w:sz w:val="22"/>
-          <w:szCs w:val="22"/>
-        </w:rPr>
-        <w:t xml:space="preserve"> con fecha de inicio 07 de agosto de 2025 y finalización 03 de marzo de 2026. Inscrito en el sistema PROMETEO como </w:t>
-      </w:r>
-      <w:r>
-        <w:rPr>
-          <w:rFonts w:ascii="Helvetica" w:hAnsi="Helvetica" w:cs="Segoe UI"/>
-          <w:b/>
-          <w:bCs/>
-          <w:color w:val="000000" w:themeColor="text1"/>
-          <w:sz w:val="22"/>
-          <w:szCs w:val="22"/>
-        </w:rPr>
-        <w:t>“Apoyo en Actividades Administrativas y Jurídicas de la Oficina Fiscal de San Miguel”</w:t>
-      </w:r>
-      <w:r>
-        <w:rPr>
-          <w:rFonts w:ascii="Helvetica" w:hAnsi="Helvetica" w:cs="Segoe UI"/>
-          <w:color w:val="000000" w:themeColor="text1"/>
-          <w:sz w:val="22"/>
-          <w:szCs w:val="22"/>
-        </w:rPr>
-        <w:t xml:space="preserve"> a desarrollar en</w:t>
-      </w:r>
-      <w:r>
-        <w:rPr>
-          <w:rFonts w:ascii="Helvetica" w:hAnsi="Helvetica" w:cs="Segoe UI"/>
-          <w:color w:val="000000" w:themeColor="text1"/>
-          <w:sz w:val="22"/>
-          <w:szCs w:val="22"/>
-        </w:rPr>
-        <w:t xml:space="preserve"> la</w:t>
-      </w:r>
-      <w:r>
-        <w:rPr>
-          <w:rFonts w:ascii="Helvetica" w:hAnsi="Helvetica" w:cs="Segoe UI"/>
-          <w:color w:val="000000" w:themeColor="text1"/>
-          <w:sz w:val="22"/>
-          <w:szCs w:val="22"/>
-        </w:rPr>
-        <w:t xml:space="preserve"> </w:t>
-      </w:r>
-      <w:r>
-        <w:rPr>
-          <w:rFonts w:ascii="Helvetica" w:hAnsi="Helvetica" w:cs="Segoe UI"/>
-          <w:b/>
-          <w:bCs/>
-          <w:color w:val="000000" w:themeColor="text1"/>
-          <w:sz w:val="22"/>
-          <w:szCs w:val="22"/>
-        </w:rPr>
-        <w:t>fiscalía general de la República, 15 calle oriente #804, Barrio Concepción, San Miguel Centro, San Miguel</w:t>
-      </w:r>
-      <w:r>
-        <w:rPr>
-          <w:rFonts w:ascii="Helvetica" w:hAnsi="Helvetica" w:cs="Segoe UI"/>
-          <w:color w:val="000000" w:themeColor="text1"/>
-          <w:sz w:val="22"/>
-          <w:szCs w:val="22"/>
-        </w:rPr>
-        <w:t xml:space="preserve">, siendo el Tutor el </w:t>
-      </w:r>
-      <w:r>
-        <w:rPr>
-          <w:rFonts w:ascii="Helvetica" w:hAnsi="Helvetica" w:cs="Segoe UI"/>
-          <w:b/>
-          <w:bCs/>
-          <w:color w:val="000000" w:themeColor="text1"/>
-          <w:sz w:val="22"/>
-          <w:szCs w:val="22"/>
-        </w:rPr>
-        <w:t>Lic.</w:t>
-      </w:r>
-      <w:r>
-        <w:rPr>
-          <w:rFonts w:ascii="Helvetica" w:hAnsi="Helvetica" w:cs="Segoe UI"/>
-          <w:color w:val="000000" w:themeColor="text1"/>
-          <w:sz w:val="22"/>
-          <w:szCs w:val="22"/>
-        </w:rPr>
-        <w:t xml:space="preserve"> </w:t>
-      </w:r>
-      <w:r>
-        <w:rPr>
-          <w:rFonts w:ascii="Helvetica" w:hAnsi="Helvetica" w:cs="Segoe UI"/>
-          <w:b/>
-          <w:bCs/>
-          <w:color w:val="000000" w:themeColor="text1"/>
-          <w:sz w:val="22"/>
-          <w:szCs w:val="22"/>
-        </w:rPr>
-        <w:t>Carlos Arnoldo Diaz Guevara</w:t>
-      </w:r>
-      <w:r>
-        <w:rPr>
-          <w:rFonts w:ascii="Helvetica" w:hAnsi="Helvetica" w:cs="Segoe UI"/>
-          <w:b/>
-          <w:bCs/>
-          <w:color w:val="000000" w:themeColor="text1"/>
-          <w:sz w:val="22"/>
-          <w:szCs w:val="22"/>
-        </w:rPr>
-        <w:t>.</w:t>
+        <w:t>Carlos Arnoldo Diaz Guevara.</w:t>
       </w:r>
       <w:r>
         <w:rPr>
@@ -1335,16 +1253,7 @@
           <w:sz w:val="22"/>
           <w:szCs w:val="22"/>
         </w:rPr>
-        <w:t>José Santo Sandoval Guevara</w:t>
-      </w:r>
-      <w:r>
-        <w:rPr>
-          <w:rFonts w:ascii="Helvetica" w:hAnsi="Helvetica" w:cs="Segoe UI"/>
-          <w:color w:val="000000" w:themeColor="text1"/>
-          <w:sz w:val="22"/>
-          <w:szCs w:val="22"/>
-        </w:rPr>
-        <w:t xml:space="preserve"> </w:t>
+        <w:t xml:space="preserve">José Santo Sandoval Guevara </w:t>
       </w:r>
       <w:r>
         <w:rPr>

</xml_diff>